<commit_message>
feldstaerke.html: move Messdaten below Darstellung, default to real data
The Messdaten switch now sits between Darstellung and Physik, and the
page starts in "Reale Daten".

Sections 1 to 6 of the worksheet expect exact readings, so its
preparation table now lists the mode as a setting to change ("auf Ideale
Daten stellen", marked like the other must-set entries) and the intro
text says the simulation starts with real data. The solution sheet
carries the same note. Section 7 then switches back to real data as
before, so its values are unchanged.

Co-Authored-By: Claude Opus 5 <noreply@anthropic.com>
</commit_message>
<xml_diff>
--- a/arbeitsblatt-feldstaerke-loesung.docx
+++ b/arbeitsblatt-feldstaerke-loesung.docx
@@ -70,6 +70,18 @@
                 <w:sz w:val="21"/>
               </w:rPr>
               <w:t>U = 2000 V,   d = 10,0 cm,   A = 500 cm²    →    E = U/d = 2000 V / 0,10 m = 20 000 V/m = 20 kV/m</w:t>
+            </w:r>
+          </w:p>
+          <w:p>
+            <w:pPr>
+              <w:spacing w:after="40"/>
+            </w:pPr>
+            <w:r>
+              <w:rPr>
+                <w:b w:val="0"/>
+                <w:sz w:val="21"/>
+              </w:rPr>
+              <w:t>Wichtig: zuerst auf „Ideale Daten“ umstellen – die Simulation startet real.</w:t>
             </w:r>
           </w:p>
           <w:p>
@@ -220,7 +232,7 @@
       </w:tr>
       <w:tr>
         <w:trPr>
-          <w:trHeight w:val="295"/>
+          <w:trHeight w:val="266"/>
         </w:trPr>
         <w:tc>
           <w:tcPr>
@@ -322,7 +334,7 @@
       </w:tr>
       <w:tr>
         <w:trPr>
-          <w:trHeight w:val="295"/>
+          <w:trHeight w:val="266"/>
         </w:trPr>
         <w:tc>
           <w:tcPr>
@@ -426,7 +438,7 @@
       </w:tr>
       <w:tr>
         <w:trPr>
-          <w:trHeight w:val="295"/>
+          <w:trHeight w:val="266"/>
         </w:trPr>
         <w:tc>
           <w:tcPr>
@@ -530,7 +542,7 @@
       </w:tr>
       <w:tr>
         <w:trPr>
-          <w:trHeight w:val="295"/>
+          <w:trHeight w:val="266"/>
         </w:trPr>
         <w:tc>
           <w:tcPr>
@@ -634,7 +646,7 @@
       </w:tr>
       <w:tr>
         <w:trPr>
-          <w:trHeight w:val="295"/>
+          <w:trHeight w:val="266"/>
         </w:trPr>
         <w:tc>
           <w:tcPr>
@@ -738,7 +750,7 @@
       </w:tr>
       <w:tr>
         <w:trPr>
-          <w:trHeight w:val="295"/>
+          <w:trHeight w:val="266"/>
         </w:trPr>
         <w:tc>
           <w:tcPr>
@@ -842,7 +854,7 @@
       </w:tr>
       <w:tr>
         <w:trPr>
-          <w:trHeight w:val="295"/>
+          <w:trHeight w:val="266"/>
         </w:trPr>
         <w:tc>
           <w:tcPr>
@@ -946,7 +958,7 @@
       </w:tr>
       <w:tr>
         <w:trPr>
-          <w:trHeight w:val="295"/>
+          <w:trHeight w:val="266"/>
         </w:trPr>
         <w:tc>
           <w:tcPr>
@@ -1050,7 +1062,7 @@
       </w:tr>
       <w:tr>
         <w:trPr>
-          <w:trHeight w:val="295"/>
+          <w:trHeight w:val="266"/>
         </w:trPr>
         <w:tc>
           <w:tcPr>
@@ -1154,7 +1166,7 @@
       </w:tr>
       <w:tr>
         <w:trPr>
-          <w:trHeight w:val="295"/>
+          <w:trHeight w:val="266"/>
         </w:trPr>
         <w:tc>
           <w:tcPr>
@@ -1258,7 +1270,7 @@
       </w:tr>
       <w:tr>
         <w:trPr>
-          <w:trHeight w:val="295"/>
+          <w:trHeight w:val="266"/>
         </w:trPr>
         <w:tc>
           <w:tcPr>
@@ -1363,7 +1375,7 @@
     </w:tbl>
     <w:p>
       <w:pPr>
-        <w:spacing w:before="100" w:after="80"/>
+        <w:spacing w:before="80" w:after="80"/>
       </w:pPr>
       <w:r>
         <w:rPr>
@@ -1372,7 +1384,7 @@
           <w:color w:val="555555"/>
           <w:sz w:val="19"/>
         </w:rPr>
-        <w:t>Die Simulation zeigt bis 80 µN zwei, ab 100 µN eine Nachkommastelle an – die Schülerwerte lauten also 20,00 / 40,00 / … / 100,0 / … / 200,0 µN.</w:t>
+        <w:t>Anzeige der Simulation: bis 80 µN zwei, ab 100 µN eine Nachkommastelle.</w:t>
       </w:r>
     </w:p>
     <w:p>

</xml_diff>